<commit_message>
Document verified public multiplayer replay release
</commit_message>
<xml_diff>
--- a/docx/07-开发实现与验收手册.docx
+++ b/docx/07-开发实现与验收手册.docx
@@ -45,7 +45,7 @@
     </w:p>
     <w:p>
       <w:r>
-        <w:t>本轮目标已经落实到代码；本地功能与多轮测试通过，公开部署后的实际验证单独补记，不能从本地结果推定线上通过。</w:t>
+        <w:t>本轮目标已完成，原公开站点已更新。本地测试、GitHub自动检查和实际公开网址均分别验证通过，具体证据见第四节。</w:t>
       </w:r>
     </w:p>
     <w:p>
@@ -164,7 +164,12 @@
     </w:p>
     <w:p>
       <w:r>
-        <w:t>线上发布与公开访问验证将在部署后补记。</w:t>
+        <w:t>线上验证：2026年9月13日原公开网址已运行v0.4。Sites访问模式为public，未登录Chrome通过编辑器、Python与JavaScript训练及全部播放控制。三个独立会话完成三轮混合语言联机，各客户端战报JSON相同，分别暂停在不同位置且终点比分一致；刷新恢复、回看旧轮和原房间再赛通过，无页面脚本错误。</w:t>
+      </w:r>
+    </w:p>
+    <w:p>
+      <w:r>
+        <w:t>线上三轮提交至验收耗时约36.0、36.3、36.7秒，包含网络和测试操作，不等同于纯计算耗时。已部署应用提交为26acff53ddcfe4fb7c27d6601b5f36680ae1b3a5，Sites保存版本5部署成功；对应GitHub检查34748350335通过。本文档后补验收记录不会改变已部署应用代码。</w:t>
       </w:r>
     </w:p>
     <w:sectPr>

</xml_diff>